<commit_message>
Erzeugt von automatischer lernOS Produktionskette
</commit_message>
<xml_diff>
--- a/de/lernos-barcamp-guide.docx
+++ b/de/lernos-barcamp-guide.docx
@@ -68,7 +68,7 @@
         </w:p>
       </w:sdtContent>
     </w:sdt>
-    <w:bookmarkStart w:id="24" w:name="über-lernos"/>
+    <w:bookmarkStart w:id="13" w:name="über-lernos"/>
     <w:p>
       <w:pPr>
         <w:pStyle w:val="Heading1"/>
@@ -136,7 +136,7 @@
       <w:r>
         <w:t xml:space="preserve"> </w:t>
       </w:r>
-      <w:hyperlink r:id="rId20">
+      <w:hyperlink r:id="rId9">
         <w:r>
           <w:rPr>
             <w:rStyle w:val="Hyperlink"/>
@@ -160,18 +160,18 @@
           <wp:inline>
             <wp:extent cx="1117600" cy="393700"/>
             <wp:effectExtent b="0" l="0" r="0" t="0"/>
-            <wp:docPr descr="" title="" id="22" name="Picture"/>
+            <wp:docPr descr="" title="" id="11" name="Picture"/>
             <a:graphic>
               <a:graphicData uri="http://schemas.openxmlformats.org/drawingml/2006/picture">
                 <pic:pic>
                   <pic:nvPicPr>
-                    <pic:cNvPr descr="https://i.creativecommons.org/l/by/4.0/88x31.png" id="23" name="Picture"/>
+                    <pic:cNvPr descr="https://i.creativecommons.org/l/by/4.0/88x31.png" id="12" name="Picture"/>
                     <pic:cNvPicPr>
                       <a:picLocks noChangeArrowheads="1" noChangeAspect="1"/>
                     </pic:cNvPicPr>
                   </pic:nvPicPr>
                   <pic:blipFill>
-                    <a:blip r:embed="rId21"/>
+                    <a:blip r:embed="rId10"/>
                     <a:stretch>
                       <a:fillRect/>
                     </a:stretch>
@@ -310,8 +310,8 @@
         <w:t xml:space="preserve">- Du darst keine zusätzlichen Klauseln oder technische Verfahren einsetzen, die anderen rechtlich irgendetwas untersagen, was die Lizenz erlaubt.</w:t>
       </w:r>
     </w:p>
-    <w:bookmarkEnd w:id="24"/>
-    <w:bookmarkStart w:id="63" w:name="grundlagen"/>
+    <w:bookmarkEnd w:id="13"/>
+    <w:bookmarkStart w:id="52" w:name="grundlagen"/>
     <w:p>
       <w:pPr>
         <w:pStyle w:val="Heading1"/>
@@ -377,7 +377,7 @@
         <w:t xml:space="preserve">Skalierbarkeit von No Thrills/DIY/Rebell without a Crew bis Deluxe ()</w:t>
       </w:r>
     </w:p>
-    <w:bookmarkStart w:id="30" w:name="geschichte-der-barcamps"/>
+    <w:bookmarkStart w:id="19" w:name="geschichte-der-barcamps"/>
     <w:p>
       <w:pPr>
         <w:pStyle w:val="Heading2"/>
@@ -405,7 +405,7 @@
       <w:r>
         <w:t xml:space="preserve"> </w:t>
       </w:r>
-      <w:hyperlink r:id="rId25">
+      <w:hyperlink r:id="rId14">
         <w:r>
           <w:rPr>
             <w:rStyle w:val="Hyperlink"/>
@@ -422,7 +422,7 @@
       <w:r>
         <w:t xml:space="preserve"> </w:t>
       </w:r>
-      <w:hyperlink r:id="rId26">
+      <w:hyperlink r:id="rId15">
         <w:r>
           <w:rPr>
             <w:rStyle w:val="Hyperlink"/>
@@ -465,7 +465,7 @@
       <w:r>
         <w:t xml:space="preserve">eine offene Bar für die Freunde des Verlags (FOO = Friends Of O’Reilly) organisieren wollte. Da nach dem Platzen der Dotcom-Blase standen im Verlag viele Räume leer und die Idee des Foo Camps konnte -</w:t>
       </w:r>
-      <w:hyperlink r:id="rId27">
+      <w:hyperlink r:id="rId16">
         <w:r>
           <w:rPr>
             <w:rStyle w:val="Hyperlink"/>
@@ -487,7 +487,7 @@
       <w:r>
         <w:t xml:space="preserve"> </w:t>
       </w:r>
-      <w:hyperlink r:id="rId28">
+      <w:hyperlink r:id="rId17">
         <w:r>
           <w:rPr>
             <w:rStyle w:val="Hyperlink"/>
@@ -557,7 +557,7 @@
       <w:r>
         <w:t xml:space="preserve"> </w:t>
       </w:r>
-      <w:hyperlink r:id="rId29">
+      <w:hyperlink r:id="rId18">
         <w:r>
           <w:rPr>
             <w:rStyle w:val="Hyperlink"/>
@@ -569,8 +569,8 @@
         <w:t xml:space="preserve">, das vom 16.-17.12.2006 in den Räumen von Novell und dem Linux Business Campus stattfand. Zu den größten Barcamps weltweit gehört das BarCamp Myanmar, das 2013 mit über 6.400 Teilnehmern stattfand. Als übliche Größe für BarCamps hat sich aber eher 50-300 Teilnehmer herausgestellt.</w:t>
       </w:r>
     </w:p>
-    <w:bookmarkEnd w:id="30"/>
-    <w:bookmarkStart w:id="31" w:name="die-barcamp-dna"/>
+    <w:bookmarkEnd w:id="19"/>
+    <w:bookmarkStart w:id="20" w:name="die-barcamp-dna"/>
     <w:p>
       <w:pPr>
         <w:pStyle w:val="Heading2"/>
@@ -864,8 +864,8 @@
         <w:t xml:space="preserve">Grafik, Ablauf aus Teilnehmersicht, Erlebenskurve, Energie vor/nach Barcamp (Barcamp ist mehr als die x Tage)</w:t>
       </w:r>
     </w:p>
-    <w:bookmarkEnd w:id="31"/>
-    <w:bookmarkStart w:id="45" w:name="organisation-von-barcamps"/>
+    <w:bookmarkEnd w:id="20"/>
+    <w:bookmarkStart w:id="34" w:name="organisation-von-barcamps"/>
     <w:p>
       <w:pPr>
         <w:pStyle w:val="Heading2"/>
@@ -915,7 +915,7 @@
         <w:t xml:space="preserve">Lass Dich nicht abschrecken, von der sehr ausführlichen Aufgabenliste, die wir hier beschreiben. Streiche die so zusammen, dass dein BarCamp gut genug läuft, gerade, wenn es Dein erstes ist!</w:t>
       </w:r>
     </w:p>
-    <w:bookmarkStart w:id="32" w:name="initialisierung-und-planung-woche-0-khp"/>
+    <w:bookmarkStart w:id="21" w:name="initialisierung-und-planung-woche-0-khp"/>
     <w:p>
       <w:pPr>
         <w:pStyle w:val="Heading3"/>
@@ -1176,8 +1176,8 @@
         <w:t xml:space="preserve">“Führe das BarCamp-OrgaTeam Kick-off durch”</w:t>
       </w:r>
     </w:p>
-    <w:bookmarkEnd w:id="32"/>
-    <w:bookmarkStart w:id="43" w:name="ausführung-woche-1-11"/>
+    <w:bookmarkEnd w:id="21"/>
+    <w:bookmarkStart w:id="32" w:name="ausführung-woche-1-11"/>
     <w:p>
       <w:pPr>
         <w:pStyle w:val="Heading3"/>
@@ -1195,7 +1195,7 @@
         <w:t xml:space="preserve">Ausführung (Woche 1-11)</w:t>
       </w:r>
     </w:p>
-    <w:bookmarkStart w:id="33" w:name="sponsoring-khp"/>
+    <w:bookmarkStart w:id="22" w:name="sponsoring-khp"/>
     <w:p>
       <w:pPr>
         <w:pStyle w:val="Heading4"/>
@@ -1369,8 +1369,8 @@
         <w:t xml:space="preserve">Notiere Dir den jeweiligen Entscheidungsstand auf Deiner Sponsorenliste</w:t>
       </w:r>
     </w:p>
-    <w:bookmarkEnd w:id="33"/>
-    <w:bookmarkStart w:id="34" w:name="veranstaltungsort-khp"/>
+    <w:bookmarkEnd w:id="22"/>
+    <w:bookmarkStart w:id="23" w:name="veranstaltungsort-khp"/>
     <w:p>
       <w:pPr>
         <w:pStyle w:val="Heading4"/>
@@ -1703,8 +1703,8 @@
         <w:t xml:space="preserve">Plane die Kosten für die Hilfskräfte ein, und erkundige Dich, wo Du die herbekommen kannst.</w:t>
       </w:r>
     </w:p>
-    <w:bookmarkEnd w:id="34"/>
-    <w:bookmarkStart w:id="35" w:name="veranstaltungsdesign-sd"/>
+    <w:bookmarkEnd w:id="23"/>
+    <w:bookmarkStart w:id="24" w:name="veranstaltungsdesign-sd"/>
     <w:p>
       <w:pPr>
         <w:pStyle w:val="Heading4"/>
@@ -1730,8 +1730,8 @@
         <w:t xml:space="preserve">Drehbuch, Moderation, Musik, Licht, Abendveranstaltung etc., User Journey durch den Tag, Teilgebenden-Registrierung, Eröffnung im Plenum: Einstimmung, BarCamp-Erklärung, Vorstellungsrunde oder Begrüßungsritual, Sessionplanung, Zeitplan / Sessiondauer, Session-Dokumentation, Kommunikation während dem Camp, Tagesabschluß / BarCamp-Abschluß, (Welcome Talk) etc., Nachbereitung, Varianten</w:t>
       </w:r>
     </w:p>
-    <w:bookmarkEnd w:id="35"/>
-    <w:bookmarkStart w:id="36" w:name="it-infrastruktur-sd"/>
+    <w:bookmarkEnd w:id="24"/>
+    <w:bookmarkStart w:id="25" w:name="it-infrastruktur-sd"/>
     <w:p>
       <w:pPr>
         <w:pStyle w:val="Heading4"/>
@@ -1757,8 +1757,8 @@
         <w:t xml:space="preserve">Webseite, Community Plattform (inkl. Dokumentation), Anmeldung/Ticketing, Webseite pflegen, Austausch-Plattform für die BarCamp Community bereitstellen und pflegen, Session-Dokumentation vorbereiten und bereitstellen</w:t>
       </w:r>
     </w:p>
-    <w:bookmarkEnd w:id="36"/>
-    <w:bookmarkStart w:id="37" w:name="veranstaltungsmarketing-khp"/>
+    <w:bookmarkEnd w:id="25"/>
+    <w:bookmarkStart w:id="26" w:name="veranstaltungsmarketing-khp"/>
     <w:p>
       <w:pPr>
         <w:pStyle w:val="Heading4"/>
@@ -1961,8 +1961,8 @@
         <w:t xml:space="preserve">Leg den Twitter-Hashtag für Dein BarCamp fest und veröffentlich ihn auf der Homepage</w:t>
       </w:r>
     </w:p>
-    <w:bookmarkEnd w:id="37"/>
-    <w:bookmarkStart w:id="38" w:name="community-management-sd"/>
+    <w:bookmarkEnd w:id="26"/>
+    <w:bookmarkStart w:id="27" w:name="community-management-sd"/>
     <w:p>
       <w:pPr>
         <w:pStyle w:val="Heading4"/>
@@ -1988,8 +1988,8 @@
         <w:t xml:space="preserve">Teilnehmer, Experten reinziehen, Kommunikation vor dem Camp, Im Vorfeld Lust aufs Corporate Learning Camp machen, interessante Experten für Mitmachen gewinnen, evt. Presse einladen, nach dem Camp Berichte und Ergebnisse sammeln und veröffentlichen</w:t>
       </w:r>
     </w:p>
-    <w:bookmarkEnd w:id="38"/>
-    <w:bookmarkStart w:id="39" w:name="catering-khp"/>
+    <w:bookmarkEnd w:id="27"/>
+    <w:bookmarkStart w:id="28" w:name="catering-khp"/>
     <w:p>
       <w:pPr>
         <w:pStyle w:val="Heading4"/>
@@ -2113,8 +2113,8 @@
         <w:t xml:space="preserve">Plane ggf. Helfer während des Camps für Getränke- und Essensbereitstellung ein</w:t>
       </w:r>
     </w:p>
-    <w:bookmarkEnd w:id="39"/>
-    <w:bookmarkStart w:id="40" w:name="veranstaltungslogistik-sd"/>
+    <w:bookmarkEnd w:id="28"/>
+    <w:bookmarkStart w:id="29" w:name="veranstaltungslogistik-sd"/>
     <w:p>
       <w:pPr>
         <w:pStyle w:val="Heading4"/>
@@ -2140,8 +2140,8 @@
         <w:t xml:space="preserve">Ausdrucke, Bestellisten, Poster, Anlieferadresse, Sponsorenplätze, Steckdosen</w:t>
       </w:r>
     </w:p>
-    <w:bookmarkEnd w:id="40"/>
-    <w:bookmarkStart w:id="41" w:name="veranstaltungsdurchführung-khp"/>
+    <w:bookmarkEnd w:id="29"/>
+    <w:bookmarkStart w:id="30" w:name="veranstaltungsdurchführung-khp"/>
     <w:p>
       <w:pPr>
         <w:pStyle w:val="Heading4"/>
@@ -2897,8 +2897,8 @@
         <w:t xml:space="preserve">Erkundige Dich, wie die Übergabe der Räume stattfinden soll</w:t>
       </w:r>
     </w:p>
-    <w:bookmarkEnd w:id="41"/>
-    <w:bookmarkStart w:id="42" w:name="nachbereitung-sd"/>
+    <w:bookmarkEnd w:id="30"/>
+    <w:bookmarkStart w:id="31" w:name="nachbereitung-sd"/>
     <w:p>
       <w:pPr>
         <w:pStyle w:val="Heading4"/>
@@ -2924,9 +2924,9 @@
         <w:t xml:space="preserve">Kommunikation nach dem Camp, Sponsorendank, Fotos, Video, Audiograf bereitstellen etc.</w:t>
       </w:r>
     </w:p>
-    <w:bookmarkEnd w:id="42"/>
-    <w:bookmarkEnd w:id="43"/>
-    <w:bookmarkStart w:id="44" w:name="abschluss-woche-12-sd"/>
+    <w:bookmarkEnd w:id="31"/>
+    <w:bookmarkEnd w:id="32"/>
+    <w:bookmarkStart w:id="33" w:name="abschluss-woche-12-sd"/>
     <w:p>
       <w:pPr>
         <w:pStyle w:val="Heading3"/>
@@ -2956,9 +2956,9 @@
         <w:t xml:space="preserve">Retro</w:t>
       </w:r>
     </w:p>
-    <w:bookmarkEnd w:id="44"/>
-    <w:bookmarkEnd w:id="45"/>
-    <w:bookmarkStart w:id="60" w:name="rollen-beim-barcamp"/>
+    <w:bookmarkEnd w:id="33"/>
+    <w:bookmarkEnd w:id="34"/>
+    <w:bookmarkStart w:id="49" w:name="rollen-beim-barcamp"/>
     <w:p>
       <w:pPr>
         <w:pStyle w:val="Heading2"/>
@@ -2984,7 +2984,7 @@
         <w:t xml:space="preserve">Laß Dich nicht abschrecken von so vielen Rollen für die Organisation eines BarCamps. Eigentlich reichen 3 bis 4 Personen, die ein BarCamp vorbereiten und verantwortlich durchführen. Bei kleinen BarCamps kannst Du auch alle Rollen ganz allein ausfüllen. Die hier aufgeführten Rollen sollen nur deutlich machen, welche unterschiedlichen Aufgaben-Erwartungen bei der BarCamp-Organisation erfüllt werden müssen.</w:t>
       </w:r>
     </w:p>
-    <w:bookmarkStart w:id="46" w:name="projektleiter-und-orga-team-khp"/>
+    <w:bookmarkStart w:id="35" w:name="projektleiter-und-orga-team-khp"/>
     <w:p>
       <w:pPr>
         <w:pStyle w:val="Heading3"/>
@@ -3186,8 +3186,8 @@
         </w:pict>
       </w:r>
     </w:p>
-    <w:bookmarkEnd w:id="46"/>
-    <w:bookmarkStart w:id="47" w:name="veranstalter-khp"/>
+    <w:bookmarkEnd w:id="35"/>
+    <w:bookmarkStart w:id="36" w:name="veranstalter-khp"/>
     <w:p>
       <w:pPr>
         <w:pStyle w:val="Heading3"/>
@@ -3276,8 +3276,8 @@
         <w:t xml:space="preserve">Veranstalter können sich finanziell, mit Räumen, Personal oder anderen Leistungen beteiligen</w:t>
       </w:r>
     </w:p>
-    <w:bookmarkEnd w:id="47"/>
-    <w:bookmarkStart w:id="48" w:name="fundraiser-khp"/>
+    <w:bookmarkEnd w:id="36"/>
+    <w:bookmarkStart w:id="37" w:name="fundraiser-khp"/>
     <w:p>
       <w:pPr>
         <w:pStyle w:val="Heading3"/>
@@ -3440,8 +3440,8 @@
         <w:t xml:space="preserve">Den Sponsoren Rechnungen stellen</w:t>
       </w:r>
     </w:p>
-    <w:bookmarkEnd w:id="48"/>
-    <w:bookmarkStart w:id="49" w:name="lokaler-ansprechpartner-khp"/>
+    <w:bookmarkEnd w:id="37"/>
+    <w:bookmarkStart w:id="38" w:name="lokaler-ansprechpartner-khp"/>
     <w:p>
       <w:pPr>
         <w:pStyle w:val="Heading3"/>
@@ -3596,8 +3596,8 @@
         <w:t xml:space="preserve">ggf. Tische, Strühle, Flipcharts u. Ähnliches bereitstellen</w:t>
       </w:r>
     </w:p>
-    <w:bookmarkEnd w:id="49"/>
-    <w:bookmarkStart w:id="50" w:name="marketer-khp"/>
+    <w:bookmarkEnd w:id="38"/>
+    <w:bookmarkStart w:id="39" w:name="marketer-khp"/>
     <w:p>
       <w:pPr>
         <w:pStyle w:val="Heading3"/>
@@ -3747,8 +3747,8 @@
         <w:t xml:space="preserve">evt. Aktionen vor dem BarCamp starten, wie eine thematisch passende Blogprade, ein TwitterChat, ein Webinar mit inhaltlichem Bezug zum BarCamp-Thema, ….</w:t>
       </w:r>
     </w:p>
-    <w:bookmarkEnd w:id="50"/>
-    <w:bookmarkStart w:id="51" w:name="it-verantwortlicher-sd"/>
+    <w:bookmarkEnd w:id="39"/>
+    <w:bookmarkStart w:id="40" w:name="it-verantwortlicher-sd"/>
     <w:p>
       <w:pPr>
         <w:pStyle w:val="Heading3"/>
@@ -3794,8 +3794,8 @@
         <w:t xml:space="preserve">…</w:t>
       </w:r>
     </w:p>
-    <w:bookmarkEnd w:id="51"/>
-    <w:bookmarkStart w:id="52" w:name="community-manager-sd"/>
+    <w:bookmarkEnd w:id="40"/>
+    <w:bookmarkStart w:id="41" w:name="community-manager-sd"/>
     <w:p>
       <w:pPr>
         <w:pStyle w:val="Heading3"/>
@@ -3841,8 +3841,8 @@
         <w:t xml:space="preserve">…</w:t>
       </w:r>
     </w:p>
-    <w:bookmarkEnd w:id="52"/>
-    <w:bookmarkStart w:id="53" w:name="moderator-khp"/>
+    <w:bookmarkEnd w:id="41"/>
+    <w:bookmarkStart w:id="42" w:name="moderator-khp"/>
     <w:p>
       <w:pPr>
         <w:pStyle w:val="Heading3"/>
@@ -4021,8 +4021,8 @@
         <w:t xml:space="preserve">Am Ende im Plenum den gemeinsamen Tagesabschluß moderieren</w:t>
       </w:r>
     </w:p>
-    <w:bookmarkEnd w:id="53"/>
-    <w:bookmarkStart w:id="54" w:name="session-planer-sd"/>
+    <w:bookmarkEnd w:id="42"/>
+    <w:bookmarkStart w:id="43" w:name="session-planer-sd"/>
     <w:p>
       <w:pPr>
         <w:pStyle w:val="Heading3"/>
@@ -4068,8 +4068,8 @@
         <w:t xml:space="preserve">…</w:t>
       </w:r>
     </w:p>
-    <w:bookmarkEnd w:id="54"/>
-    <w:bookmarkStart w:id="55" w:name="empfang-und-info-desk-khp"/>
+    <w:bookmarkEnd w:id="43"/>
+    <w:bookmarkStart w:id="44" w:name="empfang-und-info-desk-khp"/>
     <w:p>
       <w:pPr>
         <w:pStyle w:val="Heading3"/>
@@ -4174,8 +4174,8 @@
         <w:t xml:space="preserve">Hinweise zur Garderobe und zum Plenumsraum</w:t>
       </w:r>
     </w:p>
-    <w:bookmarkEnd w:id="55"/>
-    <w:bookmarkStart w:id="56" w:name="gästebetreuer-sd"/>
+    <w:bookmarkEnd w:id="44"/>
+    <w:bookmarkStart w:id="45" w:name="gästebetreuer-sd"/>
     <w:p>
       <w:pPr>
         <w:pStyle w:val="Heading3"/>
@@ -4233,8 +4233,8 @@
         <w:t xml:space="preserve">…</w:t>
       </w:r>
     </w:p>
-    <w:bookmarkEnd w:id="56"/>
-    <w:bookmarkStart w:id="57" w:name="fotograf-sd"/>
+    <w:bookmarkEnd w:id="45"/>
+    <w:bookmarkStart w:id="46" w:name="fotograf-sd"/>
     <w:p>
       <w:pPr>
         <w:pStyle w:val="Heading3"/>
@@ -4292,8 +4292,8 @@
         <w:t xml:space="preserve">…</w:t>
       </w:r>
     </w:p>
-    <w:bookmarkEnd w:id="57"/>
-    <w:bookmarkStart w:id="58" w:name="videograf-khp"/>
+    <w:bookmarkEnd w:id="46"/>
+    <w:bookmarkStart w:id="47" w:name="videograf-khp"/>
     <w:p>
       <w:pPr>
         <w:pStyle w:val="Heading3"/>
@@ -4442,8 +4442,8 @@
         <w:t xml:space="preserve">ggf. Atmo-Video zusammenschneiden</w:t>
       </w:r>
     </w:p>
-    <w:bookmarkEnd w:id="58"/>
-    <w:bookmarkStart w:id="59" w:name="audiograf-sd"/>
+    <w:bookmarkEnd w:id="47"/>
+    <w:bookmarkStart w:id="48" w:name="audiograf-sd"/>
     <w:p>
       <w:pPr>
         <w:pStyle w:val="Heading3"/>
@@ -4501,9 +4501,9 @@
         <w:t xml:space="preserve">…</w:t>
       </w:r>
     </w:p>
-    <w:bookmarkEnd w:id="59"/>
-    <w:bookmarkEnd w:id="60"/>
-    <w:bookmarkStart w:id="61" w:name="infrastruktur-für-barcamps"/>
+    <w:bookmarkEnd w:id="48"/>
+    <w:bookmarkEnd w:id="49"/>
+    <w:bookmarkStart w:id="50" w:name="infrastruktur-für-barcamps"/>
     <w:p>
       <w:pPr>
         <w:pStyle w:val="Heading2"/>
@@ -4529,8 +4529,8 @@
         <w:t xml:space="preserve">Webseite, Anmeldeprozess, Community Plattform</w:t>
       </w:r>
     </w:p>
-    <w:bookmarkEnd w:id="61"/>
-    <w:bookmarkStart w:id="62" w:name="barcamp-beispiele"/>
+    <w:bookmarkEnd w:id="50"/>
+    <w:bookmarkStart w:id="51" w:name="barcamp-beispiele"/>
     <w:p>
       <w:pPr>
         <w:pStyle w:val="Heading2"/>
@@ -4640,9 +4640,9 @@
         <w:t xml:space="preserve">KnowledgeCamp (Andreas/Simon)</w:t>
       </w:r>
     </w:p>
-    <w:bookmarkEnd w:id="62"/>
-    <w:bookmarkEnd w:id="63"/>
-    <w:bookmarkStart w:id="85" w:name="barcamp-lernpfad"/>
+    <w:bookmarkEnd w:id="51"/>
+    <w:bookmarkEnd w:id="52"/>
+    <w:bookmarkStart w:id="74" w:name="barcamp-lernpfad"/>
     <w:p>
       <w:pPr>
         <w:pStyle w:val="Heading1"/>
@@ -4660,7 +4660,7 @@
         <w:t xml:space="preserve">BarCamp Lernpfad</w:t>
       </w:r>
     </w:p>
-    <w:bookmarkStart w:id="64" w:name="organisatoren-checkliste"/>
+    <w:bookmarkStart w:id="53" w:name="organisatoren-checkliste"/>
     <w:p>
       <w:pPr>
         <w:pStyle w:val="Heading2"/>
@@ -4686,8 +4686,8 @@
         <w:t xml:space="preserve">… für das Kick-off und den Regeltermin …</w:t>
       </w:r>
     </w:p>
-    <w:bookmarkEnd w:id="64"/>
-    <w:bookmarkStart w:id="65" w:name="kata-get-started-sd"/>
+    <w:bookmarkEnd w:id="53"/>
+    <w:bookmarkStart w:id="54" w:name="kata-get-started-sd"/>
     <w:p>
       <w:pPr>
         <w:pStyle w:val="Heading2"/>
@@ -4713,8 +4713,8 @@
         <w:t xml:space="preserve">Mache dich mit den Grundlagen des Podcastings über das Grundlagen-Kapitel sowie die weiterführenden Literatur- und Weblinks vertraut.</w:t>
       </w:r>
     </w:p>
-    <w:bookmarkEnd w:id="65"/>
-    <w:bookmarkStart w:id="66" w:name="X47b3f203081c799a47f39e2a302a035669bd22b"/>
+    <w:bookmarkEnd w:id="54"/>
+    <w:bookmarkStart w:id="55" w:name="X47b3f203081c799a47f39e2a302a035669bd22b"/>
     <w:p>
       <w:pPr>
         <w:pStyle w:val="Heading2"/>
@@ -4929,8 +4929,8 @@
         <w:t xml:space="preserve">Vielleicht findest Du gut dokumentierte BarCamps, die Du auch aus der Ferne zusätzlich ein wenig auswerten kannst.</w:t>
       </w:r>
     </w:p>
-    <w:bookmarkEnd w:id="66"/>
-    <w:bookmarkStart w:id="70" w:name="kata-fülle-den-barcamp-canvas-aus-sd"/>
+    <w:bookmarkEnd w:id="55"/>
+    <w:bookmarkStart w:id="59" w:name="kata-fülle-den-barcamp-canvas-aus-sd"/>
     <w:p>
       <w:pPr>
         <w:pStyle w:val="Heading2"/>
@@ -4965,18 +4965,18 @@
           <wp:inline>
             <wp:extent cx="5334000" cy="3919798"/>
             <wp:effectExtent b="0" l="0" r="0" t="0"/>
-            <wp:docPr descr="lernOS Barcamp Canvas" title="" id="68" name="Picture"/>
+            <wp:docPr descr="lernOS Barcamp Canvas" title="" id="57" name="Picture"/>
             <a:graphic>
               <a:graphicData uri="http://schemas.openxmlformats.org/drawingml/2006/picture">
                 <pic:pic>
                   <pic:nvPicPr>
-                    <pic:cNvPr descr="images/lernOS-Barcamp-Canvas-de-300dpi.png" id="69" name="Picture"/>
+                    <pic:cNvPr descr="images/lernOS-Barcamp-Canvas-de-300dpi.png" id="58" name="Picture"/>
                     <pic:cNvPicPr>
                       <a:picLocks noChangeArrowheads="1" noChangeAspect="1"/>
                     </pic:cNvPicPr>
                   </pic:nvPicPr>
                   <pic:blipFill>
-                    <a:blip r:embed="rId67"/>
+                    <a:blip r:embed="rId56"/>
                     <a:stretch>
                       <a:fillRect/>
                     </a:stretch>
@@ -5011,8 +5011,8 @@
         <w:t xml:space="preserve">lernOS Barcamp Canvas</w:t>
       </w:r>
     </w:p>
-    <w:bookmarkEnd w:id="70"/>
-    <w:bookmarkStart w:id="71" w:name="kata-erstelle-den-barcamp-steckbrief-khp"/>
+    <w:bookmarkEnd w:id="59"/>
+    <w:bookmarkStart w:id="60" w:name="kata-erstelle-den-barcamp-steckbrief-khp"/>
     <w:p>
       <w:pPr>
         <w:pStyle w:val="Heading2"/>
@@ -5166,8 +5166,8 @@
         <w:t xml:space="preserve">Ticket-Kosten</w:t>
       </w:r>
     </w:p>
-    <w:bookmarkEnd w:id="71"/>
-    <w:bookmarkStart w:id="72" w:name="X851dddd2be5e5c8982841284cf3ca16dc750353"/>
+    <w:bookmarkEnd w:id="60"/>
+    <w:bookmarkStart w:id="61" w:name="X851dddd2be5e5c8982841284cf3ca16dc750353"/>
     <w:p>
       <w:pPr>
         <w:pStyle w:val="Heading2"/>
@@ -5265,8 +5265,8 @@
         <w:t xml:space="preserve">Besprich den Aufgabenplan und bitte die OrgaTeam-Mitglieder, bis zum nächsten Treffen eine der oben beschriebenen Rollen (Checkliste) zu wählen. Vereinbare auch gleich regelmäßige Termine für die gegenseitige Information - am besten online mit jeweils maximal 45 Minuten, im Abstand von jeweils 2 bis 3 Wochen.</w:t>
       </w:r>
     </w:p>
-    <w:bookmarkEnd w:id="72"/>
-    <w:bookmarkStart w:id="73" w:name="Xd6e3352acf0cfda2340672f56999b6f1a424237"/>
+    <w:bookmarkEnd w:id="61"/>
+    <w:bookmarkStart w:id="62" w:name="Xd6e3352acf0cfda2340672f56999b6f1a424237"/>
     <w:p>
       <w:pPr>
         <w:pStyle w:val="Heading2"/>
@@ -5292,8 +5292,8 @@
         <w:t xml:space="preserve">Experten, Influencer, Hochschulen … die wichtig für das Barcamp sind …</w:t>
       </w:r>
     </w:p>
-    <w:bookmarkEnd w:id="73"/>
-    <w:bookmarkStart w:id="74" w:name="X6006c8fc3ccc4b75c3cba1f2f98fe9b8d1e34e9"/>
+    <w:bookmarkEnd w:id="62"/>
+    <w:bookmarkStart w:id="63" w:name="X6006c8fc3ccc4b75c3cba1f2f98fe9b8d1e34e9"/>
     <w:p>
       <w:pPr>
         <w:pStyle w:val="Heading2"/>
@@ -5319,8 +5319,8 @@
         <w:t xml:space="preserve">Marketing, PR. Wann willst du was an welche Zielgruppe kommunizieren</w:t>
       </w:r>
     </w:p>
-    <w:bookmarkEnd w:id="74"/>
-    <w:bookmarkStart w:id="75" w:name="Xd44f98d3e6b1af78aaf1ebd9490214e2e23b13d"/>
+    <w:bookmarkEnd w:id="63"/>
+    <w:bookmarkStart w:id="64" w:name="Xd44f98d3e6b1af78aaf1ebd9490214e2e23b13d"/>
     <w:p>
       <w:pPr>
         <w:pStyle w:val="Heading2"/>
@@ -5455,8 +5455,8 @@
         <w:t xml:space="preserve">Falls Du einen Abendevent planst: Wenn möglich am gleichen Ort. Es braucht dort nur gutes Essen, Getränke und eine angenehme Atmosphäre (geeignete Beleuchtung, evt. Hintergrundmusik). Die Vernetzung der Teilgebenden steht im Vordergrund. Verzichte auf Live-Musik (die stört meist nur).</w:t>
       </w:r>
     </w:p>
-    <w:bookmarkEnd w:id="75"/>
-    <w:bookmarkStart w:id="76" w:name="X84e7e041ac6f628ee687b06069baa5ffbd0a207"/>
+    <w:bookmarkEnd w:id="64"/>
+    <w:bookmarkStart w:id="65" w:name="X84e7e041ac6f628ee687b06069baa5ffbd0a207"/>
     <w:p>
       <w:pPr>
         <w:pStyle w:val="Heading2"/>
@@ -5482,8 +5482,8 @@
         <w:t xml:space="preserve">Webseite + Anmeldeprozess</w:t>
       </w:r>
     </w:p>
-    <w:bookmarkEnd w:id="76"/>
-    <w:bookmarkStart w:id="77" w:name="X658c8b03ba358793f0cdf55de6714fc862e523c"/>
+    <w:bookmarkEnd w:id="65"/>
+    <w:bookmarkStart w:id="66" w:name="X658c8b03ba358793f0cdf55de6714fc862e523c"/>
     <w:p>
       <w:pPr>
         <w:pStyle w:val="Heading2"/>
@@ -5501,8 +5501,8 @@
         <w:t xml:space="preserve">Kata: Baue eine Community Plattform auf (SD)</w:t>
       </w:r>
     </w:p>
-    <w:bookmarkEnd w:id="77"/>
-    <w:bookmarkStart w:id="78" w:name="X0565a6c6e9cee285d3a1a589be7930b9a16271a"/>
+    <w:bookmarkEnd w:id="66"/>
+    <w:bookmarkStart w:id="67" w:name="X0565a6c6e9cee285d3a1a589be7930b9a16271a"/>
     <w:p>
       <w:pPr>
         <w:pStyle w:val="Heading2"/>
@@ -5760,8 +5760,8 @@
         <w:t xml:space="preserve">Wenn das Essen außerhalb stattfindet, sorge für klare Weg-Beschreibungen oder Führer</w:t>
       </w:r>
     </w:p>
-    <w:bookmarkEnd w:id="78"/>
-    <w:bookmarkStart w:id="81" w:name="X66ee470b1d6f3778c061b847cd133751129b9ff"/>
+    <w:bookmarkEnd w:id="67"/>
+    <w:bookmarkStart w:id="70" w:name="X66ee470b1d6f3778c061b847cd133751129b9ff"/>
     <w:p>
       <w:pPr>
         <w:pStyle w:val="Heading2"/>
@@ -5938,7 +5938,7 @@
       <w:r>
         <w:t xml:space="preserve"> </w:t>
       </w:r>
-      <w:hyperlink r:id="rId79">
+      <w:hyperlink r:id="rId68">
         <w:r>
           <w:rPr>
             <w:rStyle w:val="Hyperlink"/>
@@ -5967,7 +5967,7 @@
       <w:r>
         <w:t xml:space="preserve"> </w:t>
       </w:r>
-      <w:hyperlink r:id="rId80">
+      <w:hyperlink r:id="rId69">
         <w:r>
           <w:rPr>
             <w:rStyle w:val="Hyperlink"/>
@@ -6006,8 +6006,8 @@
         <w:t xml:space="preserve">Erstelle ein Drehbuch mit allen Deinen Beiträgen, für die BarCamp-Eröffnung, die Einstimmung der Teilgebenden in das Format, die Einleitung der Vorstellrunde und für die Sessionplanung</w:t>
       </w:r>
     </w:p>
-    <w:bookmarkEnd w:id="81"/>
-    <w:bookmarkStart w:id="82" w:name="Xb64b9f0e45715326ccc9c15f8e95e2c8076049d"/>
+    <w:bookmarkEnd w:id="70"/>
+    <w:bookmarkStart w:id="71" w:name="Xb64b9f0e45715326ccc9c15f8e95e2c8076049d"/>
     <w:p>
       <w:pPr>
         <w:pStyle w:val="Heading2"/>
@@ -6033,8 +6033,8 @@
         <w:t xml:space="preserve">Text, Audio, Video, Fotos, Etherpad, Google Doc</w:t>
       </w:r>
     </w:p>
-    <w:bookmarkEnd w:id="82"/>
-    <w:bookmarkStart w:id="83" w:name="Xdb9a1e632bd46224437d208727e7a2ea2279c35"/>
+    <w:bookmarkEnd w:id="71"/>
+    <w:bookmarkStart w:id="72" w:name="Xdb9a1e632bd46224437d208727e7a2ea2279c35"/>
     <w:p>
       <w:pPr>
         <w:pStyle w:val="Heading2"/>
@@ -6136,8 +6136,8 @@
         <w:t xml:space="preserve">Formuliere eine Einstimmung für Sponsoren, die Du 6 Wochen vor dem Camp versendest.</w:t>
       </w:r>
     </w:p>
-    <w:bookmarkEnd w:id="83"/>
-    <w:bookmarkStart w:id="84" w:name="X310288101f399b260efe5f7e77275342d9d5570"/>
+    <w:bookmarkEnd w:id="72"/>
+    <w:bookmarkStart w:id="73" w:name="X310288101f399b260efe5f7e77275342d9d5570"/>
     <w:p>
       <w:pPr>
         <w:pStyle w:val="Heading2"/>
@@ -6163,9 +6163,9 @@
         <w:t xml:space="preserve">Klima, Stimmung, Energielevel, Abendevent, Community Lounge, Musik, Dekoration, Licht, Kunst</w:t>
       </w:r>
     </w:p>
-    <w:bookmarkEnd w:id="84"/>
-    <w:bookmarkEnd w:id="85"/>
-    <w:bookmarkStart w:id="90" w:name="anhang"/>
+    <w:bookmarkEnd w:id="73"/>
+    <w:bookmarkEnd w:id="74"/>
+    <w:bookmarkStart w:id="79" w:name="anhang"/>
     <w:p>
       <w:pPr>
         <w:pStyle w:val="Heading1"/>
@@ -6183,7 +6183,7 @@
         <w:t xml:space="preserve">Anhang</w:t>
       </w:r>
     </w:p>
-    <w:bookmarkStart w:id="86" w:name="barcamp-checkliste"/>
+    <w:bookmarkStart w:id="75" w:name="barcamp-checkliste"/>
     <w:p>
       <w:pPr>
         <w:pStyle w:val="Heading2"/>
@@ -8351,8 +8351,8 @@
         </w:tc>
       </w:tr>
     </w:tbl>
-    <w:bookmarkEnd w:id="86"/>
-    <w:bookmarkStart w:id="87" w:name="barcamp-drehbuch"/>
+    <w:bookmarkEnd w:id="75"/>
+    <w:bookmarkStart w:id="76" w:name="barcamp-drehbuch"/>
     <w:p>
       <w:pPr>
         <w:pStyle w:val="Heading2"/>
@@ -8975,8 +8975,8 @@
         <w:t xml:space="preserve">Hinweis: bei vier Session-Runden und fünf parallelen Räumen wären so insgesamt max. 20 Sessions möglich. In der Sessionplanung sollten je erwarteter Session ca. 1-2 Minuten Zeit eingeplant werden.</w:t>
       </w:r>
     </w:p>
-    <w:bookmarkEnd w:id="87"/>
-    <w:bookmarkStart w:id="88" w:name="danksagung"/>
+    <w:bookmarkEnd w:id="76"/>
+    <w:bookmarkStart w:id="77" w:name="danksagung"/>
     <w:p>
       <w:pPr>
         <w:pStyle w:val="Heading2"/>
@@ -9002,8 +9002,8 @@
         <w:t xml:space="preserve">…</w:t>
       </w:r>
     </w:p>
-    <w:bookmarkEnd w:id="88"/>
-    <w:bookmarkStart w:id="89" w:name="änderungshistorie"/>
+    <w:bookmarkEnd w:id="77"/>
+    <w:bookmarkStart w:id="78" w:name="änderungshistorie"/>
     <w:p>
       <w:pPr>
         <w:pStyle w:val="Heading2"/>
@@ -9176,9 +9176,13 @@
         </w:tc>
       </w:tr>
     </w:tbl>
-    <w:bookmarkEnd w:id="89"/>
-    <w:bookmarkEnd w:id="90"/>
-    <w:sectPr/>
+    <w:bookmarkEnd w:id="78"/>
+    <w:bookmarkEnd w:id="79"/>
+    <w:sectPr>
+      <w:footnotePr>
+        <w:numRestart w:val="eachSect"/>
+      </w:footnotePr>
+    </w:sectPr>
   </w:body>
 </w:document>
 </file>
@@ -9536,10 +9540,10 @@
   <w:docDefaults>
     <w:rPrDefault>
       <w:rPr>
-        <w:rFonts w:asciiTheme="minorHAnsi" w:cstheme="minorBidi" w:eastAsiaTheme="minorHAnsi" w:hAnsiTheme="minorHAnsi"/>
+        <w:rFonts w:asciiTheme="minorHAnsi" w:cstheme="minorBidi" w:eastAsiaTheme="minorEastAsia" w:hAnsiTheme="minorHAnsi"/>
         <w:sz w:val="24"/>
         <w:szCs w:val="24"/>
-        <w:lang w:bidi="ar-SA" w:eastAsia="en-US" w:val="de-DE"/>
+        <w:lang w:bidi="ar-SA" w:eastAsia="zh-CN" w:val="de-DE"/>
       </w:rPr>
     </w:rPrDefault>
     <w:pPrDefault>
@@ -9591,8 +9595,6 @@
     </w:pPr>
     <w:rPr>
       <w:rFonts w:asciiTheme="majorHAnsi" w:cstheme="majorBidi" w:eastAsiaTheme="majorEastAsia" w:hAnsiTheme="majorHAnsi"/>
-      <w:spacing w:val="-10"/>
-      <w:kern w:val="28"/>
       <w:sz w:val="56"/>
       <w:szCs w:val="56"/>
     </w:rPr>
@@ -9605,8 +9607,6 @@
     <w:rsid w:val="00A10FD9"/>
     <w:rPr>
       <w:rFonts w:asciiTheme="majorHAnsi" w:cstheme="majorBidi" w:eastAsiaTheme="majorEastAsia" w:hAnsiTheme="majorHAnsi"/>
-      <w:spacing w:val="-10"/>
-      <w:kern w:val="28"/>
       <w:sz w:val="56"/>
       <w:szCs w:val="56"/>
     </w:rPr>
@@ -9647,23 +9647,31 @@
   </w:style>
   <w:style w:customStyle="1" w:styleId="Author" w:type="paragraph">
     <w:name w:val="Author"/>
+    <w:basedOn w:val="Title"/>
     <w:next w:val="BodyText"/>
     <w:qFormat/>
     <w:pPr>
       <w:keepNext/>
       <w:keepLines/>
-      <w:jc w:val="center"/>
     </w:pPr>
+    <w:rPr>
+      <w:sz w:val="24"/>
+      <w:szCs w:val="24"/>
+    </w:rPr>
   </w:style>
   <w:style w:styleId="Date" w:type="paragraph">
     <w:name w:val="Date"/>
+    <w:basedOn w:val="Title"/>
     <w:next w:val="BodyText"/>
     <w:qFormat/>
     <w:pPr>
       <w:keepNext/>
       <w:keepLines/>
-      <w:jc w:val="center"/>
     </w:pPr>
+    <w:rPr>
+      <w:sz w:val="24"/>
+      <w:szCs w:val="24"/>
+    </w:rPr>
   </w:style>
   <w:style w:customStyle="1" w:styleId="AbstractTitle" w:type="paragraph">
     <w:name w:val="Abstract Title"/>
@@ -10076,13 +10084,6 @@
       </w:tblCellMar>
     </w:tblPr>
     <w:tblStylePr w:type="firstRow">
-      <w:tblPr>
-        <w:jc w:val="left"/>
-        <w:tblInd w:type="dxa" w:w="0"/>
-      </w:tblPr>
-      <w:trPr>
-        <w:jc w:val="left"/>
-      </w:trPr>
       <w:tcPr>
         <w:tcBorders>
           <w:bottom w:val="single"/>

</xml_diff>